<commit_message>
refactor docs: ajuste del tipo de navegación
Se realizaron las correcciones en la sección de Tipo de Navegación en base a las observaciones dadas
</commit_message>
<xml_diff>
--- a/Fase#2/Organizacion del Contenido y Navegacion/Organizacion del Contenido y Navegación a Utilizar.docx
+++ b/Fase#2/Organizacion del Contenido y Navegacion/Organizacion del Contenido y Navegación a Utilizar.docx
@@ -19,11 +19,9 @@
           <w:bCs/>
           <w:sz w:val="24"/>
           <w:szCs w:val="24"/>
-          <w:lang w:val="en-US"/>
-        </w:rPr>
-        <w:t xml:space="preserve">Tipo de </w:t>
-      </w:r>
-      <w:proofErr w:type="spellStart"/>
+        </w:rPr>
+        <w:t>Tipo de Organizaci</w:t>
+      </w:r>
       <w:r>
         <w:rPr>
           <w:rFonts w:ascii="Arial" w:hAnsi="Arial" w:cs="Arial"/>
@@ -31,11 +29,274 @@
           <w:bCs/>
           <w:sz w:val="24"/>
           <w:szCs w:val="24"/>
-          <w:lang w:val="en-US"/>
-        </w:rPr>
-        <w:t>Organizaci</w:t>
-      </w:r>
-      <w:r>
+        </w:rPr>
+        <w:t>ón del Contenido</w:t>
+      </w:r>
+    </w:p>
+    <w:p>
+      <w:pPr>
+        <w:jc w:val="both"/>
+        <w:rPr>
+          <w:rFonts w:ascii="Arial" w:hAnsi="Arial" w:cs="Arial"/>
+          <w:sz w:val="24"/>
+          <w:szCs w:val="24"/>
+        </w:rPr>
+      </w:pPr>
+      <w:r>
+        <w:rPr>
+          <w:rFonts w:ascii="Arial" w:hAnsi="Arial" w:cs="Arial"/>
+          <w:sz w:val="24"/>
+          <w:szCs w:val="24"/>
+        </w:rPr>
+        <w:t xml:space="preserve">Para el sitio web de Tutorías UTDP, se utilizará la organización del contenido por jerarquía, como sabemos en la taxonomía jerárquica la información se organiza en niveles, donde una categoría principal contiene subcategorías más específicas, que a su vez pueden tener otras subcategorías. Como el contenido de Tutorías UTDP es amplio y complejo, incluyendo categorías generales como “Materias” las cuales llevarán a subcategorías más </w:t>
+      </w:r>
+      <w:r>
+        <w:rPr>
+          <w:rFonts w:ascii="Arial" w:hAnsi="Arial" w:cs="Arial"/>
+          <w:sz w:val="24"/>
+          <w:szCs w:val="24"/>
+        </w:rPr>
+        <w:t>específicas</w:t>
+      </w:r>
+      <w:r>
+        <w:rPr>
+          <w:rFonts w:ascii="Arial" w:hAnsi="Arial" w:cs="Arial"/>
+          <w:sz w:val="24"/>
+          <w:szCs w:val="24"/>
+        </w:rPr>
+        <w:t xml:space="preserve"> como “Calculo I”, la cual llevará al usuario a otras subcategorías, </w:t>
+      </w:r>
+      <w:r>
+        <w:rPr>
+          <w:rFonts w:ascii="Arial" w:hAnsi="Arial" w:cs="Arial"/>
+          <w:sz w:val="24"/>
+          <w:szCs w:val="24"/>
+        </w:rPr>
+        <w:t xml:space="preserve">este tipo de organización facilitará una navegación progresiva e intuitiva. </w:t>
+      </w:r>
+    </w:p>
+    <w:p>
+      <w:pPr>
+        <w:jc w:val="both"/>
+        <w:rPr>
+          <w:rFonts w:ascii="Arial" w:hAnsi="Arial" w:cs="Arial"/>
+          <w:sz w:val="24"/>
+          <w:szCs w:val="24"/>
+        </w:rPr>
+      </w:pPr>
+    </w:p>
+    <w:p>
+      <w:pPr>
+        <w:jc w:val="both"/>
+        <w:rPr>
+          <w:rFonts w:ascii="Arial" w:hAnsi="Arial" w:cs="Arial"/>
+          <w:sz w:val="24"/>
+          <w:szCs w:val="24"/>
+        </w:rPr>
+      </w:pPr>
+    </w:p>
+    <w:p>
+      <w:pPr>
+        <w:jc w:val="both"/>
+        <w:rPr>
+          <w:rFonts w:ascii="Arial" w:hAnsi="Arial" w:cs="Arial"/>
+          <w:sz w:val="24"/>
+          <w:szCs w:val="24"/>
+        </w:rPr>
+      </w:pPr>
+    </w:p>
+    <w:p>
+      <w:pPr>
+        <w:jc w:val="both"/>
+        <w:rPr>
+          <w:rFonts w:ascii="Arial" w:hAnsi="Arial" w:cs="Arial"/>
+          <w:sz w:val="24"/>
+          <w:szCs w:val="24"/>
+        </w:rPr>
+      </w:pPr>
+    </w:p>
+    <w:p>
+      <w:pPr>
+        <w:jc w:val="both"/>
+        <w:rPr>
+          <w:rFonts w:ascii="Arial" w:hAnsi="Arial" w:cs="Arial"/>
+          <w:sz w:val="24"/>
+          <w:szCs w:val="24"/>
+        </w:rPr>
+      </w:pPr>
+    </w:p>
+    <w:p>
+      <w:pPr>
+        <w:jc w:val="both"/>
+        <w:rPr>
+          <w:rFonts w:ascii="Arial" w:hAnsi="Arial" w:cs="Arial"/>
+          <w:sz w:val="24"/>
+          <w:szCs w:val="24"/>
+        </w:rPr>
+      </w:pPr>
+    </w:p>
+    <w:p>
+      <w:pPr>
+        <w:jc w:val="both"/>
+        <w:rPr>
+          <w:rFonts w:ascii="Arial" w:hAnsi="Arial" w:cs="Arial"/>
+          <w:sz w:val="24"/>
+          <w:szCs w:val="24"/>
+        </w:rPr>
+      </w:pPr>
+    </w:p>
+    <w:p>
+      <w:pPr>
+        <w:jc w:val="both"/>
+        <w:rPr>
+          <w:rFonts w:ascii="Arial" w:hAnsi="Arial" w:cs="Arial"/>
+          <w:sz w:val="24"/>
+          <w:szCs w:val="24"/>
+        </w:rPr>
+      </w:pPr>
+    </w:p>
+    <w:p>
+      <w:pPr>
+        <w:jc w:val="both"/>
+        <w:rPr>
+          <w:rFonts w:ascii="Arial" w:hAnsi="Arial" w:cs="Arial"/>
+          <w:sz w:val="24"/>
+          <w:szCs w:val="24"/>
+        </w:rPr>
+      </w:pPr>
+    </w:p>
+    <w:p>
+      <w:pPr>
+        <w:jc w:val="both"/>
+        <w:rPr>
+          <w:rFonts w:ascii="Arial" w:hAnsi="Arial" w:cs="Arial"/>
+          <w:sz w:val="24"/>
+          <w:szCs w:val="24"/>
+        </w:rPr>
+      </w:pPr>
+    </w:p>
+    <w:p>
+      <w:pPr>
+        <w:jc w:val="both"/>
+        <w:rPr>
+          <w:rFonts w:ascii="Arial" w:hAnsi="Arial" w:cs="Arial"/>
+          <w:sz w:val="24"/>
+          <w:szCs w:val="24"/>
+        </w:rPr>
+      </w:pPr>
+    </w:p>
+    <w:p>
+      <w:pPr>
+        <w:jc w:val="both"/>
+        <w:rPr>
+          <w:rFonts w:ascii="Arial" w:hAnsi="Arial" w:cs="Arial"/>
+          <w:sz w:val="24"/>
+          <w:szCs w:val="24"/>
+        </w:rPr>
+      </w:pPr>
+    </w:p>
+    <w:p>
+      <w:pPr>
+        <w:jc w:val="both"/>
+        <w:rPr>
+          <w:rFonts w:ascii="Arial" w:hAnsi="Arial" w:cs="Arial"/>
+          <w:sz w:val="24"/>
+          <w:szCs w:val="24"/>
+        </w:rPr>
+      </w:pPr>
+    </w:p>
+    <w:p>
+      <w:pPr>
+        <w:jc w:val="both"/>
+        <w:rPr>
+          <w:rFonts w:ascii="Arial" w:hAnsi="Arial" w:cs="Arial"/>
+          <w:sz w:val="24"/>
+          <w:szCs w:val="24"/>
+        </w:rPr>
+      </w:pPr>
+    </w:p>
+    <w:p>
+      <w:pPr>
+        <w:jc w:val="both"/>
+        <w:rPr>
+          <w:rFonts w:ascii="Arial" w:hAnsi="Arial" w:cs="Arial"/>
+          <w:sz w:val="24"/>
+          <w:szCs w:val="24"/>
+        </w:rPr>
+      </w:pPr>
+    </w:p>
+    <w:p>
+      <w:pPr>
+        <w:jc w:val="both"/>
+        <w:rPr>
+          <w:rFonts w:ascii="Arial" w:hAnsi="Arial" w:cs="Arial"/>
+          <w:sz w:val="24"/>
+          <w:szCs w:val="24"/>
+        </w:rPr>
+      </w:pPr>
+    </w:p>
+    <w:p>
+      <w:pPr>
+        <w:jc w:val="both"/>
+        <w:rPr>
+          <w:rFonts w:ascii="Arial" w:hAnsi="Arial" w:cs="Arial"/>
+          <w:sz w:val="24"/>
+          <w:szCs w:val="24"/>
+        </w:rPr>
+      </w:pPr>
+    </w:p>
+    <w:p>
+      <w:pPr>
+        <w:jc w:val="both"/>
+        <w:rPr>
+          <w:rFonts w:ascii="Arial" w:hAnsi="Arial" w:cs="Arial"/>
+          <w:sz w:val="24"/>
+          <w:szCs w:val="24"/>
+        </w:rPr>
+      </w:pPr>
+    </w:p>
+    <w:p>
+      <w:pPr>
+        <w:jc w:val="both"/>
+        <w:rPr>
+          <w:rFonts w:ascii="Arial" w:hAnsi="Arial" w:cs="Arial"/>
+          <w:sz w:val="24"/>
+          <w:szCs w:val="24"/>
+        </w:rPr>
+      </w:pPr>
+    </w:p>
+    <w:p>
+      <w:pPr>
+        <w:jc w:val="both"/>
+        <w:rPr>
+          <w:rFonts w:ascii="Arial" w:hAnsi="Arial" w:cs="Arial"/>
+          <w:sz w:val="24"/>
+          <w:szCs w:val="24"/>
+        </w:rPr>
+      </w:pPr>
+    </w:p>
+    <w:p>
+      <w:pPr>
+        <w:jc w:val="both"/>
+        <w:rPr>
+          <w:rFonts w:ascii="Arial" w:hAnsi="Arial" w:cs="Arial"/>
+          <w:sz w:val="24"/>
+          <w:szCs w:val="24"/>
+        </w:rPr>
+      </w:pPr>
+    </w:p>
+    <w:p>
+      <w:pPr>
+        <w:jc w:val="both"/>
+        <w:rPr>
+          <w:rFonts w:ascii="Arial" w:hAnsi="Arial" w:cs="Arial"/>
+          <w:sz w:val="24"/>
+          <w:szCs w:val="24"/>
+        </w:rPr>
+      </w:pPr>
+    </w:p>
+    <w:p>
+      <w:pPr>
         <w:rPr>
           <w:rFonts w:ascii="Arial" w:hAnsi="Arial" w:cs="Arial"/>
           <w:b/>
@@ -43,9 +304,7 @@
           <w:sz w:val="24"/>
           <w:szCs w:val="24"/>
         </w:rPr>
-        <w:t>ón</w:t>
-      </w:r>
-      <w:proofErr w:type="spellEnd"/>
+      </w:pPr>
       <w:r>
         <w:rPr>
           <w:rFonts w:ascii="Arial" w:hAnsi="Arial" w:cs="Arial"/>
@@ -54,273 +313,205 @@
           <w:sz w:val="24"/>
           <w:szCs w:val="24"/>
         </w:rPr>
-        <w:t xml:space="preserve"> del Contenido</w:t>
-      </w:r>
-    </w:p>
-    <w:p>
-      <w:pPr>
-        <w:jc w:val="both"/>
-        <w:rPr>
-          <w:rFonts w:ascii="Arial" w:hAnsi="Arial" w:cs="Arial"/>
-          <w:sz w:val="24"/>
-          <w:szCs w:val="24"/>
-        </w:rPr>
-      </w:pPr>
-      <w:r>
-        <w:rPr>
-          <w:rFonts w:ascii="Arial" w:hAnsi="Arial" w:cs="Arial"/>
-          <w:sz w:val="24"/>
-          <w:szCs w:val="24"/>
-        </w:rPr>
-        <w:t xml:space="preserve">Para el sitio web de Tutorías UTDP, se utilizará la organización del contenido por jerarquía, como sabemos en la taxonomía jerárquica la información se organiza en niveles, donde una categoría principal contiene subcategorías más específicas, que a su vez pueden tener otras subcategorías. Como el contenido de Tutorías UTDP es amplio y complejo, incluyendo categorías generales como “Materias” las cuales llevarán a subcategorías más </w:t>
-      </w:r>
-      <w:r>
-        <w:rPr>
-          <w:rFonts w:ascii="Arial" w:hAnsi="Arial" w:cs="Arial"/>
-          <w:sz w:val="24"/>
-          <w:szCs w:val="24"/>
-        </w:rPr>
-        <w:t>específicas</w:t>
-      </w:r>
-      <w:r>
-        <w:rPr>
-          <w:rFonts w:ascii="Arial" w:hAnsi="Arial" w:cs="Arial"/>
-          <w:sz w:val="24"/>
-          <w:szCs w:val="24"/>
-        </w:rPr>
-        <w:t xml:space="preserve"> como “Calculo I”, la cual llevará al usuario a otras subcategorías, </w:t>
-      </w:r>
-      <w:r>
-        <w:rPr>
-          <w:rFonts w:ascii="Arial" w:hAnsi="Arial" w:cs="Arial"/>
-          <w:sz w:val="24"/>
-          <w:szCs w:val="24"/>
-        </w:rPr>
-        <w:t xml:space="preserve">este tipo de organización facilitará una navegación progresiva e intuitiva. </w:t>
-      </w:r>
-    </w:p>
-    <w:p>
-      <w:pPr>
-        <w:jc w:val="both"/>
-        <w:rPr>
-          <w:rFonts w:ascii="Arial" w:hAnsi="Arial" w:cs="Arial"/>
-          <w:sz w:val="24"/>
-          <w:szCs w:val="24"/>
-        </w:rPr>
-      </w:pPr>
-    </w:p>
-    <w:p>
-      <w:pPr>
-        <w:jc w:val="both"/>
-        <w:rPr>
-          <w:rFonts w:ascii="Arial" w:hAnsi="Arial" w:cs="Arial"/>
-          <w:sz w:val="24"/>
-          <w:szCs w:val="24"/>
-        </w:rPr>
-      </w:pPr>
-    </w:p>
-    <w:p>
-      <w:pPr>
-        <w:jc w:val="both"/>
-        <w:rPr>
-          <w:rFonts w:ascii="Arial" w:hAnsi="Arial" w:cs="Arial"/>
-          <w:sz w:val="24"/>
-          <w:szCs w:val="24"/>
-        </w:rPr>
-      </w:pPr>
-    </w:p>
-    <w:p>
-      <w:pPr>
-        <w:jc w:val="both"/>
-        <w:rPr>
-          <w:rFonts w:ascii="Arial" w:hAnsi="Arial" w:cs="Arial"/>
-          <w:sz w:val="24"/>
-          <w:szCs w:val="24"/>
-        </w:rPr>
-      </w:pPr>
-    </w:p>
-    <w:p>
-      <w:pPr>
-        <w:jc w:val="both"/>
-        <w:rPr>
-          <w:rFonts w:ascii="Arial" w:hAnsi="Arial" w:cs="Arial"/>
-          <w:sz w:val="24"/>
-          <w:szCs w:val="24"/>
-        </w:rPr>
-      </w:pPr>
-    </w:p>
-    <w:p>
-      <w:pPr>
-        <w:jc w:val="both"/>
-        <w:rPr>
-          <w:rFonts w:ascii="Arial" w:hAnsi="Arial" w:cs="Arial"/>
-          <w:sz w:val="24"/>
-          <w:szCs w:val="24"/>
-        </w:rPr>
-      </w:pPr>
-    </w:p>
-    <w:p>
-      <w:pPr>
-        <w:jc w:val="both"/>
-        <w:rPr>
-          <w:rFonts w:ascii="Arial" w:hAnsi="Arial" w:cs="Arial"/>
-          <w:sz w:val="24"/>
-          <w:szCs w:val="24"/>
-        </w:rPr>
-      </w:pPr>
-    </w:p>
-    <w:p>
-      <w:pPr>
-        <w:jc w:val="both"/>
-        <w:rPr>
-          <w:rFonts w:ascii="Arial" w:hAnsi="Arial" w:cs="Arial"/>
-          <w:sz w:val="24"/>
-          <w:szCs w:val="24"/>
-        </w:rPr>
-      </w:pPr>
-    </w:p>
-    <w:p>
-      <w:pPr>
-        <w:jc w:val="both"/>
-        <w:rPr>
-          <w:rFonts w:ascii="Arial" w:hAnsi="Arial" w:cs="Arial"/>
-          <w:sz w:val="24"/>
-          <w:szCs w:val="24"/>
-        </w:rPr>
-      </w:pPr>
-    </w:p>
-    <w:p>
-      <w:pPr>
-        <w:jc w:val="both"/>
-        <w:rPr>
-          <w:rFonts w:ascii="Arial" w:hAnsi="Arial" w:cs="Arial"/>
-          <w:sz w:val="24"/>
-          <w:szCs w:val="24"/>
-        </w:rPr>
-      </w:pPr>
-    </w:p>
-    <w:p>
-      <w:pPr>
-        <w:jc w:val="both"/>
-        <w:rPr>
-          <w:rFonts w:ascii="Arial" w:hAnsi="Arial" w:cs="Arial"/>
-          <w:sz w:val="24"/>
-          <w:szCs w:val="24"/>
-        </w:rPr>
-      </w:pPr>
-    </w:p>
-    <w:p>
-      <w:pPr>
-        <w:jc w:val="both"/>
-        <w:rPr>
-          <w:rFonts w:ascii="Arial" w:hAnsi="Arial" w:cs="Arial"/>
-          <w:sz w:val="24"/>
-          <w:szCs w:val="24"/>
-        </w:rPr>
-      </w:pPr>
-    </w:p>
-    <w:p>
-      <w:pPr>
-        <w:jc w:val="both"/>
-        <w:rPr>
-          <w:rFonts w:ascii="Arial" w:hAnsi="Arial" w:cs="Arial"/>
-          <w:sz w:val="24"/>
-          <w:szCs w:val="24"/>
-        </w:rPr>
-      </w:pPr>
-    </w:p>
-    <w:p>
-      <w:pPr>
-        <w:jc w:val="both"/>
-        <w:rPr>
-          <w:rFonts w:ascii="Arial" w:hAnsi="Arial" w:cs="Arial"/>
-          <w:sz w:val="24"/>
-          <w:szCs w:val="24"/>
-        </w:rPr>
-      </w:pPr>
-    </w:p>
-    <w:p>
-      <w:pPr>
-        <w:jc w:val="both"/>
-        <w:rPr>
-          <w:rFonts w:ascii="Arial" w:hAnsi="Arial" w:cs="Arial"/>
-          <w:sz w:val="24"/>
-          <w:szCs w:val="24"/>
-        </w:rPr>
-      </w:pPr>
-    </w:p>
-    <w:p>
-      <w:pPr>
-        <w:jc w:val="both"/>
-        <w:rPr>
-          <w:rFonts w:ascii="Arial" w:hAnsi="Arial" w:cs="Arial"/>
-          <w:sz w:val="24"/>
-          <w:szCs w:val="24"/>
-        </w:rPr>
-      </w:pPr>
-    </w:p>
-    <w:p>
-      <w:pPr>
-        <w:jc w:val="both"/>
-        <w:rPr>
-          <w:rFonts w:ascii="Arial" w:hAnsi="Arial" w:cs="Arial"/>
-          <w:sz w:val="24"/>
-          <w:szCs w:val="24"/>
-        </w:rPr>
-      </w:pPr>
-    </w:p>
-    <w:p>
-      <w:pPr>
-        <w:jc w:val="both"/>
-        <w:rPr>
-          <w:rFonts w:ascii="Arial" w:hAnsi="Arial" w:cs="Arial"/>
-          <w:sz w:val="24"/>
-          <w:szCs w:val="24"/>
-        </w:rPr>
-      </w:pPr>
-    </w:p>
-    <w:p>
-      <w:pPr>
-        <w:jc w:val="both"/>
-        <w:rPr>
-          <w:rFonts w:ascii="Arial" w:hAnsi="Arial" w:cs="Arial"/>
-          <w:sz w:val="24"/>
-          <w:szCs w:val="24"/>
-        </w:rPr>
-      </w:pPr>
-    </w:p>
-    <w:p>
-      <w:pPr>
-        <w:jc w:val="both"/>
-        <w:rPr>
-          <w:rFonts w:ascii="Arial" w:hAnsi="Arial" w:cs="Arial"/>
-          <w:sz w:val="24"/>
-          <w:szCs w:val="24"/>
-        </w:rPr>
-      </w:pPr>
-    </w:p>
-    <w:p>
-      <w:pPr>
-        <w:jc w:val="both"/>
-        <w:rPr>
-          <w:rFonts w:ascii="Arial" w:hAnsi="Arial" w:cs="Arial"/>
-          <w:sz w:val="24"/>
-          <w:szCs w:val="24"/>
-        </w:rPr>
-      </w:pPr>
-    </w:p>
-    <w:p>
-      <w:pPr>
-        <w:jc w:val="both"/>
-        <w:rPr>
-          <w:rFonts w:ascii="Arial" w:hAnsi="Arial" w:cs="Arial"/>
-          <w:sz w:val="24"/>
-          <w:szCs w:val="24"/>
-        </w:rPr>
-      </w:pPr>
-    </w:p>
-    <w:p>
-      <w:pPr>
+        <w:lastRenderedPageBreak/>
+        <w:t>Tipo de Navegación a Utilizar</w:t>
+      </w:r>
+    </w:p>
+    <w:p>
+      <w:pPr>
+        <w:jc w:val="both"/>
+        <w:rPr>
+          <w:rFonts w:ascii="Arial" w:hAnsi="Arial" w:cs="Arial"/>
+          <w:sz w:val="24"/>
+          <w:szCs w:val="24"/>
+        </w:rPr>
+      </w:pPr>
+      <w:r>
+        <w:rPr>
+          <w:rFonts w:ascii="Arial" w:hAnsi="Arial" w:cs="Arial"/>
+          <w:sz w:val="24"/>
+          <w:szCs w:val="24"/>
+        </w:rPr>
+        <w:t>Para el sitio web Tutorías UTDP, se implementarán varios tipos de navegación que permitan al usuario desplazarse de manera fluida, intuitiva y coherente entre las distintas secciones.</w:t>
+      </w:r>
+    </w:p>
+    <w:p>
+      <w:pPr>
+        <w:jc w:val="both"/>
+        <w:rPr>
+          <w:rFonts w:ascii="Arial" w:hAnsi="Arial" w:cs="Arial"/>
+          <w:sz w:val="24"/>
+          <w:szCs w:val="24"/>
+        </w:rPr>
+      </w:pPr>
+      <w:r>
+        <w:rPr>
+          <w:rFonts w:ascii="Arial" w:hAnsi="Arial" w:cs="Arial"/>
+          <w:sz w:val="24"/>
+          <w:szCs w:val="24"/>
+        </w:rPr>
+        <w:t>La navegación global será la principal del sitio</w:t>
+      </w:r>
+      <w:r>
+        <w:rPr>
+          <w:rFonts w:ascii="Arial" w:hAnsi="Arial" w:cs="Arial"/>
+          <w:sz w:val="24"/>
+          <w:szCs w:val="24"/>
+        </w:rPr>
+        <w:t xml:space="preserve"> y estará ubicada en la barra de navegación, permitiendo </w:t>
+      </w:r>
+      <w:r>
+        <w:rPr>
+          <w:rFonts w:ascii="Arial" w:hAnsi="Arial" w:cs="Arial"/>
+          <w:sz w:val="24"/>
+          <w:szCs w:val="24"/>
+        </w:rPr>
+        <w:t xml:space="preserve">acceder a las </w:t>
+      </w:r>
+      <w:r>
+        <w:rPr>
+          <w:rFonts w:ascii="Arial" w:hAnsi="Arial" w:cs="Arial"/>
+          <w:sz w:val="24"/>
+          <w:szCs w:val="24"/>
+        </w:rPr>
+        <w:t>categorías</w:t>
+      </w:r>
+      <w:r>
+        <w:rPr>
+          <w:rFonts w:ascii="Arial" w:hAnsi="Arial" w:cs="Arial"/>
+          <w:sz w:val="24"/>
+          <w:szCs w:val="24"/>
+        </w:rPr>
+        <w:t xml:space="preserve"> generales: Inicio, Materias, Evaluar, Nosotros y Perfil</w:t>
+      </w:r>
+      <w:r>
+        <w:rPr>
+          <w:rFonts w:ascii="Arial" w:hAnsi="Arial" w:cs="Arial"/>
+          <w:sz w:val="24"/>
+          <w:szCs w:val="24"/>
+        </w:rPr>
+        <w:t>. Esta navegación facilitará el movimiento entre las secciones principales sin perder el contexto, aunque no desde absolutamente cualquier parte de la página, ya que en ciertos flujos en específico se restringirá la navegación para mantener la coherencia del proceso.</w:t>
+      </w:r>
+    </w:p>
+    <w:p>
+      <w:pPr>
+        <w:jc w:val="both"/>
+        <w:rPr>
+          <w:rFonts w:ascii="Arial" w:hAnsi="Arial" w:cs="Arial"/>
+          <w:sz w:val="24"/>
+          <w:szCs w:val="24"/>
+        </w:rPr>
+      </w:pPr>
+      <w:r>
+        <w:rPr>
+          <w:rFonts w:ascii="Arial" w:hAnsi="Arial" w:cs="Arial"/>
+          <w:sz w:val="24"/>
+          <w:szCs w:val="24"/>
+        </w:rPr>
+        <w:t xml:space="preserve">Por otro lado, </w:t>
+      </w:r>
+      <w:r>
+        <w:rPr>
+          <w:rFonts w:ascii="Arial" w:hAnsi="Arial" w:cs="Arial"/>
+          <w:sz w:val="24"/>
+          <w:szCs w:val="24"/>
+        </w:rPr>
+        <w:t xml:space="preserve">se aplicará la navegación procesual en las acciones que implican interacción directa con el sistema, tales como Inscribirse, </w:t>
+      </w:r>
+      <w:proofErr w:type="spellStart"/>
+      <w:r>
+        <w:rPr>
+          <w:rFonts w:ascii="Arial" w:hAnsi="Arial" w:cs="Arial"/>
+          <w:sz w:val="24"/>
+          <w:szCs w:val="24"/>
+        </w:rPr>
+        <w:t>Desinscribirse</w:t>
+      </w:r>
+      <w:proofErr w:type="spellEnd"/>
+      <w:r>
+        <w:rPr>
+          <w:rFonts w:ascii="Arial" w:hAnsi="Arial" w:cs="Arial"/>
+          <w:sz w:val="24"/>
+          <w:szCs w:val="24"/>
+        </w:rPr>
+        <w:t xml:space="preserve"> o Actualizar Credenciales. Este tipo de navegación guía al usuario en el flujo de un proceso dentro del sitio, garantizando claridad y retroalimentación en cada paso.  </w:t>
+      </w:r>
+    </w:p>
+    <w:p>
+      <w:pPr>
+        <w:jc w:val="both"/>
+        <w:rPr>
+          <w:rFonts w:ascii="Arial" w:hAnsi="Arial" w:cs="Arial"/>
+          <w:sz w:val="24"/>
+          <w:szCs w:val="24"/>
+        </w:rPr>
+      </w:pPr>
+      <w:r>
+        <w:rPr>
+          <w:rFonts w:ascii="Arial" w:hAnsi="Arial" w:cs="Arial"/>
+          <w:sz w:val="24"/>
+          <w:szCs w:val="24"/>
+        </w:rPr>
+        <w:t>Se utilizará también la navegación jerárquica, en la sección de Materias, donde el usuario podrá acceder a subcategorías como Cálculo I, Cálculo II o Física I. Este tipo de navegación representa la estructura padre-hijo del contenido y permite profundizar progresivamente dentro de una categoría principal.</w:t>
+      </w:r>
+    </w:p>
+    <w:p>
+      <w:pPr>
+        <w:jc w:val="both"/>
+        <w:rPr>
+          <w:rFonts w:ascii="Arial" w:hAnsi="Arial" w:cs="Arial"/>
+          <w:sz w:val="24"/>
+          <w:szCs w:val="24"/>
+        </w:rPr>
+      </w:pPr>
+      <w:r>
+        <w:rPr>
+          <w:rFonts w:ascii="Arial" w:hAnsi="Arial" w:cs="Arial"/>
+          <w:sz w:val="24"/>
+          <w:szCs w:val="24"/>
+        </w:rPr>
+        <w:t xml:space="preserve">Además, el sitio contará con una meta navegación, la cual se ubicará en el encabezado o </w:t>
+      </w:r>
+      <w:proofErr w:type="spellStart"/>
+      <w:r>
+        <w:rPr>
+          <w:rFonts w:ascii="Arial" w:hAnsi="Arial" w:cs="Arial"/>
+          <w:sz w:val="24"/>
+          <w:szCs w:val="24"/>
+        </w:rPr>
+        <w:t>header</w:t>
+      </w:r>
+      <w:proofErr w:type="spellEnd"/>
+      <w:r>
+        <w:rPr>
+          <w:rFonts w:ascii="Arial" w:hAnsi="Arial" w:cs="Arial"/>
+          <w:sz w:val="24"/>
+          <w:szCs w:val="24"/>
+        </w:rPr>
+        <w:t>, está incluirá la opción de Perfil, y cuando el usuario se encuentre en el apartado de Perfil, Cerrar Sesión, las cuales permitirán al usuario acceder a funciones globales relacionados con su cuenta.</w:t>
+      </w:r>
+    </w:p>
+    <w:p>
+      <w:pPr>
+        <w:jc w:val="both"/>
+        <w:rPr>
+          <w:rFonts w:ascii="Arial" w:hAnsi="Arial" w:cs="Arial"/>
+          <w:sz w:val="24"/>
+          <w:szCs w:val="24"/>
+        </w:rPr>
+      </w:pPr>
+      <w:r>
+        <w:rPr>
+          <w:rFonts w:ascii="Arial" w:hAnsi="Arial" w:cs="Arial"/>
+          <w:sz w:val="24"/>
+          <w:szCs w:val="24"/>
+        </w:rPr>
+        <w:t xml:space="preserve">Finalmente, se mantendrá un uso limitado de navegación local, será aplicada únicamente dentro del Perfil, donde el usuario podrá moverse entre Datos Personales, Sesiones Anteriores y Sesiones Pendientes. En otras secciones como Materias o Evaluar, no se aplicará este tipo de navegación. </w:t>
+      </w:r>
+    </w:p>
+    <w:p>
+      <w:pPr>
+        <w:jc w:val="both"/>
         <w:rPr>
           <w:rFonts w:ascii="Arial" w:hAnsi="Arial" w:cs="Arial"/>
           <w:b/>
@@ -329,142 +520,21 @@
           <w:szCs w:val="24"/>
         </w:rPr>
       </w:pPr>
-      <w:proofErr w:type="gramStart"/>
-      <w:r>
-        <w:rPr>
-          <w:rFonts w:ascii="Arial" w:hAnsi="Arial" w:cs="Arial"/>
-          <w:b/>
-          <w:bCs/>
-          <w:sz w:val="24"/>
-          <w:szCs w:val="24"/>
-        </w:rPr>
-        <w:lastRenderedPageBreak/>
-        <w:t>Tipo de Navegación a Utilizar</w:t>
-      </w:r>
-      <w:proofErr w:type="gramEnd"/>
-    </w:p>
-    <w:p>
-      <w:pPr>
-        <w:jc w:val="both"/>
-        <w:rPr>
-          <w:rFonts w:ascii="Arial" w:hAnsi="Arial" w:cs="Arial"/>
-          <w:sz w:val="24"/>
-          <w:szCs w:val="24"/>
-        </w:rPr>
-      </w:pPr>
-      <w:r>
-        <w:rPr>
-          <w:rFonts w:ascii="Arial" w:hAnsi="Arial" w:cs="Arial"/>
-          <w:sz w:val="24"/>
-          <w:szCs w:val="24"/>
-        </w:rPr>
-        <w:t>Para el sitio web Tutorías UTDP, se implementarán varios tipos de navegación que permitan al usuario desplazarse de manera fluida, intuitiva y coherente entre las distintas secciones.</w:t>
-      </w:r>
-    </w:p>
-    <w:p>
-      <w:pPr>
-        <w:jc w:val="both"/>
-        <w:rPr>
-          <w:rFonts w:ascii="Arial" w:hAnsi="Arial" w:cs="Arial"/>
-          <w:sz w:val="24"/>
-          <w:szCs w:val="24"/>
-        </w:rPr>
-      </w:pPr>
-      <w:r>
-        <w:rPr>
-          <w:rFonts w:ascii="Arial" w:hAnsi="Arial" w:cs="Arial"/>
-          <w:sz w:val="24"/>
-          <w:szCs w:val="24"/>
-        </w:rPr>
-        <w:t>La navegación global será la principal del sitio, ya que permitirá acceder a las secciones generales</w:t>
-      </w:r>
-      <w:r>
-        <w:rPr>
-          <w:rFonts w:ascii="Arial" w:hAnsi="Arial" w:cs="Arial"/>
-          <w:sz w:val="24"/>
-          <w:szCs w:val="24"/>
-        </w:rPr>
-        <w:t xml:space="preserve">: </w:t>
-      </w:r>
-      <w:r>
-        <w:rPr>
-          <w:rFonts w:ascii="Arial" w:hAnsi="Arial" w:cs="Arial"/>
-          <w:sz w:val="24"/>
-          <w:szCs w:val="24"/>
-        </w:rPr>
-        <w:t>Inicio, Materias, Evaluar, Nosotros y Perfil</w:t>
-      </w:r>
-      <w:r>
-        <w:rPr>
-          <w:rFonts w:ascii="Arial" w:hAnsi="Arial" w:cs="Arial"/>
-          <w:sz w:val="24"/>
-          <w:szCs w:val="24"/>
-        </w:rPr>
-        <w:t xml:space="preserve">, </w:t>
-      </w:r>
-      <w:r>
-        <w:rPr>
-          <w:rFonts w:ascii="Arial" w:hAnsi="Arial" w:cs="Arial"/>
-          <w:sz w:val="24"/>
-          <w:szCs w:val="24"/>
-        </w:rPr>
-        <w:t>desde cualquier parte de la página sin perder el contexto. Este tipo de navegación facilitará el acceso constante a las funciones esenciales del sistema, manteniendo la coherencia visual y funcional en todo momento.</w:t>
-      </w:r>
-    </w:p>
-    <w:p>
-      <w:pPr>
-        <w:jc w:val="both"/>
-        <w:rPr>
-          <w:rFonts w:ascii="Arial" w:hAnsi="Arial" w:cs="Arial"/>
-          <w:sz w:val="24"/>
-          <w:szCs w:val="24"/>
-        </w:rPr>
-      </w:pPr>
-      <w:r>
-        <w:rPr>
-          <w:rFonts w:ascii="Arial" w:hAnsi="Arial" w:cs="Arial"/>
-          <w:sz w:val="24"/>
-          <w:szCs w:val="24"/>
-        </w:rPr>
-        <w:t>Por otro lado, se aplicará la navegación local dentro de las categorías principales, permitiendo al usuario moverse entre subapartados específicos. En el caso de Tutorías UTDP, esta se utilizará en las secciones Materias, Evaluar y Perfil. Por ejemplo, en Materias permitirá explorar asignaturas como Cálculo I, Física o Programación; en Evaluar, navegar entre las distintas sesiones a calificar; y en Perfil, acceder a Datos personales, Sesiones anteriores y Sesiones pendientes.</w:t>
-      </w:r>
-    </w:p>
-    <w:p>
-      <w:pPr>
-        <w:jc w:val="both"/>
-        <w:rPr>
-          <w:rFonts w:ascii="Arial" w:hAnsi="Arial" w:cs="Arial"/>
-          <w:sz w:val="24"/>
-          <w:szCs w:val="24"/>
-        </w:rPr>
-      </w:pPr>
-      <w:r>
-        <w:rPr>
-          <w:rFonts w:ascii="Arial" w:hAnsi="Arial" w:cs="Arial"/>
-          <w:sz w:val="24"/>
-          <w:szCs w:val="24"/>
-        </w:rPr>
-        <w:t>Asimismo, se integrará una navegación jerárquica para guiar al usuario en procesos secuenciales, como la inscripción en sesiones. En este caso, la ruta seguiría la estructura Inicio &gt; Materias &gt; Cálculo I &gt; Sesiones disponibles &gt; Inscripción, reflejando la relación padre–hijo–nieto entre las páginas.</w:t>
-      </w:r>
-    </w:p>
-    <w:p>
-      <w:pPr>
-        <w:jc w:val="both"/>
-        <w:rPr>
-          <w:rFonts w:ascii="Arial" w:hAnsi="Arial" w:cs="Arial"/>
-          <w:b/>
-          <w:bCs/>
-          <w:sz w:val="24"/>
-          <w:szCs w:val="24"/>
-        </w:rPr>
-      </w:pPr>
-      <w:r>
-        <w:rPr>
-          <w:rFonts w:ascii="Arial" w:hAnsi="Arial" w:cs="Arial"/>
-          <w:sz w:val="24"/>
-          <w:szCs w:val="24"/>
-        </w:rPr>
-        <w:t>Finalmente, la estructura de navegación del sitio se diseñará considerando principios de usabilidad como la regla de los tres clics y la Ley de Miller, asegurando que el usuario pueda alcanzar cualquier información en pocos pasos y con una carga cognitiva mínima.</w:t>
+      <w:r>
+        <w:rPr>
+          <w:rFonts w:ascii="Arial" w:hAnsi="Arial" w:cs="Arial"/>
+          <w:sz w:val="24"/>
+          <w:szCs w:val="24"/>
+        </w:rPr>
+        <w:t xml:space="preserve">La </w:t>
+      </w:r>
+      <w:r>
+        <w:rPr>
+          <w:rFonts w:ascii="Arial" w:hAnsi="Arial" w:cs="Arial"/>
+          <w:sz w:val="24"/>
+          <w:szCs w:val="24"/>
+        </w:rPr>
+        <w:t>estructura de navegación del sitio se diseñará considerando principios de usabilidad como la regla de los tres clics y la Ley de Miller, asegurando que el usuario pueda alcanzar cualquier información en pocos pasos y con una carga cognitiva mínima.</w:t>
       </w:r>
     </w:p>
     <w:p>

</xml_diff>